<commit_message>
only mp3 files remain
</commit_message>
<xml_diff>
--- a/ПейоЯворовПрограма/resources/questions.docx
+++ b/ПейоЯворовПрограма/resources/questions.docx
@@ -1,6 +1,6 @@
 
 <file path=word/document.xml><?xml version="1.0" encoding="utf-8"?>
-<w:document xmlns:wpc="http://schemas.microsoft.com/office/word/2010/wordprocessingCanvas" xmlns:cx="http://schemas.microsoft.com/office/drawing/2014/chartex" xmlns:cx1="http://schemas.microsoft.com/office/drawing/2015/9/8/chartex" xmlns:cx2="http://schemas.microsoft.com/office/drawing/2015/10/21/chartex" xmlns:cx3="http://schemas.microsoft.com/office/drawing/2016/5/9/chartex" xmlns:cx4="http://schemas.microsoft.com/office/drawing/2016/5/10/chartex" xmlns:cx5="http://schemas.microsoft.com/office/drawing/2016/5/11/chartex" xmlns:cx6="http://schemas.microsoft.com/office/drawing/2016/5/12/chartex" xmlns:cx7="http://schemas.microsoft.com/office/drawing/2016/5/13/chartex" xmlns:cx8="http://schemas.microsoft.com/office/drawing/2016/5/14/chartex" xmlns:mc="http://schemas.openxmlformats.org/markup-compatibility/2006" xmlns:aink="http://schemas.microsoft.com/office/drawing/2016/ink" xmlns:am3d="http://schemas.microsoft.com/office/drawing/2017/model3d" xmlns:o="urn:schemas-microsoft-com:office:office" xmlns:r="http://schemas.openxmlformats.org/officeDocument/2006/relationships" xmlns:m="http://schemas.openxmlformats.org/officeDocument/2006/math" xmlns:v="urn:schemas-microsoft-com:vml" xmlns:wp14="http://schemas.microsoft.com/office/word/2010/wordprocessingDrawing" xmlns:wp="http://schemas.openxmlformats.org/drawingml/2006/wordprocessingDrawing" xmlns:w10="urn:schemas-microsoft-com:office:word" xmlns:w="http://schemas.openxmlformats.org/wordprocessingml/2006/main" xmlns:w14="http://schemas.microsoft.com/office/word/2010/wordml" xmlns:w15="http://schemas.microsoft.com/office/word/2012/wordml" xmlns:w16cex="http://schemas.microsoft.com/office/word/2018/wordml/cex" xmlns:w16cid="http://schemas.microsoft.com/office/word/2016/wordml/cid" xmlns:w16="http://schemas.microsoft.com/office/word/2018/wordml" xmlns:w16sdtdh="http://schemas.microsoft.com/office/word/2020/wordml/sdtdatahash" xmlns:w16se="http://schemas.microsoft.com/office/word/2015/wordml/symex" xmlns:wpg="http://schemas.microsoft.com/office/word/2010/wordprocessingGroup" xmlns:wpi="http://schemas.microsoft.com/office/word/2010/wordprocessingInk" xmlns:wne="http://schemas.microsoft.com/office/word/2006/wordml" xmlns:wps="http://schemas.microsoft.com/office/word/2010/wordprocessingShape" mc:Ignorable="w14 w15 w16se w16cid w16 w16cex w16sdtdh wp14">
+<w:document xmlns:wpc="http://schemas.microsoft.com/office/word/2010/wordprocessingCanvas" xmlns:mc="http://schemas.openxmlformats.org/markup-compatibility/2006" xmlns:o="urn:schemas-microsoft-com:office:office" xmlns:r="http://schemas.openxmlformats.org/officeDocument/2006/relationships" xmlns:m="http://schemas.openxmlformats.org/officeDocument/2006/math" xmlns:v="urn:schemas-microsoft-com:vml" xmlns:wp14="http://schemas.microsoft.com/office/word/2010/wordprocessingDrawing" xmlns:wp="http://schemas.openxmlformats.org/drawingml/2006/wordprocessingDrawing" xmlns:w10="urn:schemas-microsoft-com:office:word" xmlns:w="http://schemas.openxmlformats.org/wordprocessingml/2006/main" xmlns:w14="http://schemas.microsoft.com/office/word/2010/wordml" xmlns:w15="http://schemas.microsoft.com/office/word/2012/wordml" xmlns:wpg="http://schemas.microsoft.com/office/word/2010/wordprocessingGroup" xmlns:wpi="http://schemas.microsoft.com/office/word/2010/wordprocessingInk" xmlns:wne="http://schemas.microsoft.com/office/word/2006/wordml" xmlns:wps="http://schemas.microsoft.com/office/word/2010/wordprocessingShape" mc:Ignorable="w14 w15 wp14">
   <w:body>
     <w:p>
       <w:pPr>
@@ -92,13 +92,7 @@
         <w:rPr>
           <w:rStyle w:val="Strong"/>
         </w:rPr>
-        <w:t>3. Нужно ли е страдание за голяма любовна поезия?</w:t>
-      </w:r>
-      <w:r>
-        <w:rPr>
-          <w:rStyle w:val="Strong"/>
-        </w:rPr>
-        <w:t xml:space="preserve"> </w:t>
+        <w:t xml:space="preserve">3. Нужно ли е страдание за голяма любовна поезия? </w:t>
       </w:r>
       <w:r>
         <w:rPr>
@@ -154,6 +148,30 @@
         </w:rPr>
         <w:t>4. Какво ви подтикна към борбата, а не само към поезията?</w:t>
       </w:r>
+      <w:r>
+        <w:rPr>
+          <w:rStyle w:val="Strong"/>
+          <w:lang w:val="en-US"/>
+        </w:rPr>
+        <w:t xml:space="preserve"> </w:t>
+      </w:r>
+      <w:r>
+        <w:rPr>
+          <w:rStyle w:val="Strong"/>
+          <w:color w:val="00B050"/>
+          <w:highlight w:val="green"/>
+          <w:lang w:val="en-US"/>
+        </w:rPr>
+        <w:t>//</w:t>
+      </w:r>
+      <w:r>
+        <w:rPr>
+          <w:rStyle w:val="Strong"/>
+          <w:color w:val="00B050"/>
+          <w:highlight w:val="green"/>
+        </w:rPr>
+        <w:t>направен</w:t>
+      </w:r>
     </w:p>
     <w:p>
       <w:pPr>
@@ -173,6 +191,20 @@
         </w:rPr>
         <w:t>5. Какво е най-тежкото от революционните години?</w:t>
       </w:r>
+      <w:r>
+        <w:rPr>
+          <w:rStyle w:val="Strong"/>
+        </w:rPr>
+        <w:t xml:space="preserve"> </w:t>
+      </w:r>
+      <w:r>
+        <w:rPr>
+          <w:rStyle w:val="Strong"/>
+          <w:color w:val="00B050"/>
+          <w:highlight w:val="green"/>
+        </w:rPr>
+        <w:t>// направен</w:t>
+      </w:r>
     </w:p>
     <w:p>
       <w:pPr>
@@ -192,6 +224,20 @@
         </w:rPr>
         <w:t>6. Струваше ли си личната цена?</w:t>
       </w:r>
+      <w:r>
+        <w:rPr>
+          <w:rStyle w:val="Strong"/>
+        </w:rPr>
+        <w:t xml:space="preserve"> </w:t>
+      </w:r>
+      <w:r>
+        <w:rPr>
+          <w:rStyle w:val="Strong"/>
+          <w:color w:val="00B050"/>
+          <w:highlight w:val="green"/>
+        </w:rPr>
+        <w:t>// направен</w:t>
+      </w:r>
     </w:p>
     <w:p>
       <w:pPr>
@@ -229,13 +275,7 @@
         <w:rPr>
           <w:rStyle w:val="Strong"/>
         </w:rPr>
-        <w:t>7. Какво чувство ви кара да пишете?</w:t>
-      </w:r>
-      <w:r>
-        <w:rPr>
-          <w:rStyle w:val="Strong"/>
-        </w:rPr>
-        <w:t xml:space="preserve"> </w:t>
+        <w:t xml:space="preserve">7. Какво чувство ви кара да пишете? </w:t>
       </w:r>
       <w:r>
         <w:rPr>
@@ -264,6 +304,20 @@
         </w:rPr>
         <w:t>8. Какво прави един стих „жив“?</w:t>
       </w:r>
+      <w:r>
+        <w:rPr>
+          <w:rStyle w:val="Strong"/>
+        </w:rPr>
+        <w:t xml:space="preserve"> </w:t>
+      </w:r>
+      <w:r>
+        <w:rPr>
+          <w:rStyle w:val="Strong"/>
+          <w:color w:val="00B050"/>
+          <w:highlight w:val="green"/>
+        </w:rPr>
+        <w:t>// направен</w:t>
+      </w:r>
     </w:p>
     <w:p>
       <w:pPr>
@@ -282,6 +336,20 @@
           <w:rStyle w:val="Strong"/>
         </w:rPr>
         <w:t>9. Трябва ли поетът да бъде разбран?</w:t>
+      </w:r>
+      <w:r>
+        <w:rPr>
+          <w:rStyle w:val="Strong"/>
+        </w:rPr>
+        <w:t xml:space="preserve"> </w:t>
+      </w:r>
+      <w:r>
+        <w:rPr>
+          <w:rStyle w:val="Strong"/>
+          <w:color w:val="00B050"/>
+          <w:highlight w:val="green"/>
+        </w:rPr>
+        <w:t>// направен</w:t>
       </w:r>
     </w:p>
     <w:p>
@@ -316,6 +384,9 @@
     <w:p>
       <w:pPr>
         <w:pStyle w:val="NormalWeb"/>
+        <w:rPr>
+          <w:lang w:val="en-US"/>
+        </w:rPr>
       </w:pPr>
       <w:r>
         <w:rPr>
@@ -342,6 +413,20 @@
         </w:rPr>
         <w:t>11. Предопределена ли е съдбата?</w:t>
       </w:r>
+      <w:r>
+        <w:rPr>
+          <w:rStyle w:val="Strong"/>
+        </w:rPr>
+        <w:t xml:space="preserve"> </w:t>
+      </w:r>
+      <w:r>
+        <w:rPr>
+          <w:rStyle w:val="Strong"/>
+          <w:color w:val="00B050"/>
+          <w:highlight w:val="green"/>
+        </w:rPr>
+        <w:t>// направен</w:t>
+      </w:r>
     </w:p>
     <w:p>
       <w:pPr>
@@ -361,6 +446,20 @@
         </w:rPr>
         <w:t>12. Какво послание бихте оставили на бъдещите поколения?</w:t>
       </w:r>
+      <w:r>
+        <w:rPr>
+          <w:rStyle w:val="Strong"/>
+        </w:rPr>
+        <w:t xml:space="preserve"> </w:t>
+      </w:r>
+      <w:r>
+        <w:rPr>
+          <w:rStyle w:val="Strong"/>
+          <w:color w:val="00B050"/>
+          <w:highlight w:val="green"/>
+        </w:rPr>
+        <w:t>// направен</w:t>
+      </w:r>
     </w:p>
     <w:p>
       <w:pPr>
@@ -419,6 +518,20 @@
         </w:rPr>
         <w:t>14. Чувствате ли се повече неразбран или повече обичан?</w:t>
       </w:r>
+      <w:r>
+        <w:rPr>
+          <w:rStyle w:val="Strong"/>
+        </w:rPr>
+        <w:t xml:space="preserve"> </w:t>
+      </w:r>
+      <w:r>
+        <w:rPr>
+          <w:rStyle w:val="Strong"/>
+          <w:color w:val="00B050"/>
+          <w:highlight w:val="green"/>
+        </w:rPr>
+        <w:t>// направен</w:t>
+      </w:r>
     </w:p>
     <w:p>
       <w:pPr>
@@ -437,6 +550,32 @@
           <w:rStyle w:val="Strong"/>
         </w:rPr>
         <w:t>15. Какво ви липсваше най-много в живота?</w:t>
+      </w:r>
+      <w:r>
+        <w:rPr>
+          <w:rStyle w:val="Strong"/>
+          <w:lang w:val="en-US"/>
+        </w:rPr>
+        <w:t xml:space="preserve"> </w:t>
+      </w:r>
+      <w:bookmarkStart w:id="0" w:name="_GoBack"/>
+      <w:bookmarkEnd w:id="0"/>
+      <w:r>
+        <w:rPr>
+          <w:rStyle w:val="Strong"/>
+          <w:color w:val="00B050"/>
+          <w:highlight w:val="green"/>
+          <w:lang w:val="en-US"/>
+        </w:rPr>
+        <w:t xml:space="preserve">// </w:t>
+      </w:r>
+      <w:r>
+        <w:rPr>
+          <w:rStyle w:val="Strong"/>
+          <w:color w:val="00B050"/>
+          <w:highlight w:val="green"/>
+        </w:rPr>
+        <w:t>направен</w:t>
       </w:r>
     </w:p>
     <w:p>
@@ -466,7 +605,7 @@
 </file>
 
 <file path=word/styles.xml><?xml version="1.0" encoding="utf-8"?>
-<w:styles xmlns:mc="http://schemas.openxmlformats.org/markup-compatibility/2006" xmlns:r="http://schemas.openxmlformats.org/officeDocument/2006/relationships" xmlns:w="http://schemas.openxmlformats.org/wordprocessingml/2006/main" xmlns:w14="http://schemas.microsoft.com/office/word/2010/wordml" xmlns:w15="http://schemas.microsoft.com/office/word/2012/wordml" xmlns:w16cex="http://schemas.microsoft.com/office/word/2018/wordml/cex" xmlns:w16cid="http://schemas.microsoft.com/office/word/2016/wordml/cid" xmlns:w16="http://schemas.microsoft.com/office/word/2018/wordml" xmlns:w16sdtdh="http://schemas.microsoft.com/office/word/2020/wordml/sdtdatahash" xmlns:w16se="http://schemas.microsoft.com/office/word/2015/wordml/symex" mc:Ignorable="w14 w15 w16se w16cid w16 w16cex w16sdtdh">
+<w:styles xmlns:mc="http://schemas.openxmlformats.org/markup-compatibility/2006" xmlns:r="http://schemas.openxmlformats.org/officeDocument/2006/relationships" xmlns:w="http://schemas.openxmlformats.org/wordprocessingml/2006/main" xmlns:w14="http://schemas.microsoft.com/office/word/2010/wordml" xmlns:w15="http://schemas.microsoft.com/office/word/2012/wordml" mc:Ignorable="w14 w15">
   <w:docDefaults>
     <w:rPrDefault>
       <w:rPr>
@@ -482,7 +621,7 @@
       </w:pPr>
     </w:pPrDefault>
   </w:docDefaults>
-  <w:latentStyles w:defLockedState="0" w:defUIPriority="99" w:defSemiHidden="0" w:defUnhideWhenUsed="0" w:defQFormat="0" w:count="376">
+  <w:latentStyles w:defLockedState="0" w:defUIPriority="99" w:defSemiHidden="0" w:defUnhideWhenUsed="0" w:defQFormat="0" w:count="371">
     <w:lsdException w:name="Normal" w:uiPriority="0" w:qFormat="1"/>
     <w:lsdException w:name="heading 1" w:uiPriority="9" w:qFormat="1"/>
     <w:lsdException w:name="heading 2" w:semiHidden="1" w:uiPriority="9" w:unhideWhenUsed="1" w:qFormat="1"/>
@@ -854,11 +993,6 @@
     <w:lsdException w:name="List Table 5 Dark Accent 6" w:uiPriority="50"/>
     <w:lsdException w:name="List Table 6 Colorful Accent 6" w:uiPriority="51"/>
     <w:lsdException w:name="List Table 7 Colorful Accent 6" w:uiPriority="52"/>
-    <w:lsdException w:name="Mention" w:semiHidden="1" w:unhideWhenUsed="1"/>
-    <w:lsdException w:name="Smart Hyperlink" w:semiHidden="1" w:unhideWhenUsed="1"/>
-    <w:lsdException w:name="Hashtag" w:semiHidden="1" w:unhideWhenUsed="1"/>
-    <w:lsdException w:name="Unresolved Mention" w:semiHidden="1" w:unhideWhenUsed="1"/>
-    <w:lsdException w:name="Smart Link" w:semiHidden="1" w:unhideWhenUsed="1"/>
   </w:latentStyles>
   <w:style w:type="paragraph" w:default="1" w:styleId="Normal">
     <w:name w:val="Normal"/>

</xml_diff>

<commit_message>
editedt the worddoc and sended it waiting for mp3 files
</commit_message>
<xml_diff>
--- a/ПейоЯворовПрограма/resources/questions.docx
+++ b/ПейоЯворовПрограма/resources/questions.docx
@@ -1,6 +1,6 @@
 
 <file path=word/document.xml><?xml version="1.0" encoding="utf-8"?>
-<w:document xmlns:wpc="http://schemas.microsoft.com/office/word/2010/wordprocessingCanvas" xmlns:mc="http://schemas.openxmlformats.org/markup-compatibility/2006" xmlns:o="urn:schemas-microsoft-com:office:office" xmlns:r="http://schemas.openxmlformats.org/officeDocument/2006/relationships" xmlns:m="http://schemas.openxmlformats.org/officeDocument/2006/math" xmlns:v="urn:schemas-microsoft-com:vml" xmlns:wp14="http://schemas.microsoft.com/office/word/2010/wordprocessingDrawing" xmlns:wp="http://schemas.openxmlformats.org/drawingml/2006/wordprocessingDrawing" xmlns:w10="urn:schemas-microsoft-com:office:word" xmlns:w="http://schemas.openxmlformats.org/wordprocessingml/2006/main" xmlns:w14="http://schemas.microsoft.com/office/word/2010/wordml" xmlns:w15="http://schemas.microsoft.com/office/word/2012/wordml" xmlns:wpg="http://schemas.microsoft.com/office/word/2010/wordprocessingGroup" xmlns:wpi="http://schemas.microsoft.com/office/word/2010/wordprocessingInk" xmlns:wne="http://schemas.microsoft.com/office/word/2006/wordml" xmlns:wps="http://schemas.microsoft.com/office/word/2010/wordprocessingShape" mc:Ignorable="w14 w15 wp14">
+<w:document xmlns:wpc="http://schemas.microsoft.com/office/word/2010/wordprocessingCanvas" xmlns:cx="http://schemas.microsoft.com/office/drawing/2014/chartex" xmlns:cx1="http://schemas.microsoft.com/office/drawing/2015/9/8/chartex" xmlns:cx2="http://schemas.microsoft.com/office/drawing/2015/10/21/chartex" xmlns:cx3="http://schemas.microsoft.com/office/drawing/2016/5/9/chartex" xmlns:cx4="http://schemas.microsoft.com/office/drawing/2016/5/10/chartex" xmlns:cx5="http://schemas.microsoft.com/office/drawing/2016/5/11/chartex" xmlns:cx6="http://schemas.microsoft.com/office/drawing/2016/5/12/chartex" xmlns:cx7="http://schemas.microsoft.com/office/drawing/2016/5/13/chartex" xmlns:cx8="http://schemas.microsoft.com/office/drawing/2016/5/14/chartex" xmlns:mc="http://schemas.openxmlformats.org/markup-compatibility/2006" xmlns:aink="http://schemas.microsoft.com/office/drawing/2016/ink" xmlns:am3d="http://schemas.microsoft.com/office/drawing/2017/model3d" xmlns:o="urn:schemas-microsoft-com:office:office" xmlns:r="http://schemas.openxmlformats.org/officeDocument/2006/relationships" xmlns:m="http://schemas.openxmlformats.org/officeDocument/2006/math" xmlns:v="urn:schemas-microsoft-com:vml" xmlns:wp14="http://schemas.microsoft.com/office/word/2010/wordprocessingDrawing" xmlns:wp="http://schemas.openxmlformats.org/drawingml/2006/wordprocessingDrawing" xmlns:w10="urn:schemas-microsoft-com:office:word" xmlns:w="http://schemas.openxmlformats.org/wordprocessingml/2006/main" xmlns:w14="http://schemas.microsoft.com/office/word/2010/wordml" xmlns:w15="http://schemas.microsoft.com/office/word/2012/wordml" xmlns:w16cex="http://schemas.microsoft.com/office/word/2018/wordml/cex" xmlns:w16cid="http://schemas.microsoft.com/office/word/2016/wordml/cid" xmlns:w16="http://schemas.microsoft.com/office/word/2018/wordml" xmlns:w16sdtdh="http://schemas.microsoft.com/office/word/2020/wordml/sdtdatahash" xmlns:w16se="http://schemas.microsoft.com/office/word/2015/wordml/symex" xmlns:wpg="http://schemas.microsoft.com/office/word/2010/wordprocessingGroup" xmlns:wpi="http://schemas.microsoft.com/office/word/2010/wordprocessingInk" xmlns:wne="http://schemas.microsoft.com/office/word/2006/wordml" xmlns:wps="http://schemas.microsoft.com/office/word/2010/wordprocessingShape" mc:Ignorable="w14 w15 w16se w16cid w16 w16cex w16sdtdh wp14">
   <w:body>
     <w:p>
       <w:pPr>
@@ -8,24 +8,10 @@
       </w:pPr>
       <w:r>
         <w:rPr>
-          <w:rFonts w:ascii="Segoe UI Emoji" w:hAnsi="Segoe UI Emoji" w:cs="Segoe UI Emoji"/>
-        </w:rPr>
-        <w:t>🌑</w:t>
-      </w:r>
-      <w:r>
-        <w:t xml:space="preserve"> </w:t>
-      </w:r>
-      <w:r>
-        <w:rPr>
-          <w:rStyle w:val="Strong"/>
-        </w:rPr>
-        <w:t>За любовта и Лора</w:t>
-      </w:r>
-    </w:p>
-    <w:p>
-      <w:pPr>
-        <w:pStyle w:val="NormalWeb"/>
-      </w:pPr>
+          <w:rFonts w:asciiTheme="minorHAnsi" w:hAnsiTheme="minorHAnsi" w:cs="Segoe UI Emoji"/>
+        </w:rPr>
+        <w:t xml:space="preserve">  </w:t>
+      </w:r>
       <w:r>
         <w:rPr>
           <w:rStyle w:val="Strong"/>
@@ -67,26 +53,120 @@
     </w:p>
     <w:p>
       <w:pPr>
-        <w:pStyle w:val="NormalWeb"/>
-      </w:pPr>
-      <w:r>
-        <w:rPr>
-          <w:rStyle w:val="Strong"/>
-        </w:rPr>
-        <w:t>2. Бихте ли променили нещо в отношенията си с Лора?</w:t>
-      </w:r>
-    </w:p>
-    <w:p>
-      <w:pPr>
-        <w:pStyle w:val="NormalWeb"/>
-      </w:pPr>
-      <w:r>
-        <w:t>Човек винаги би променил нещо, когато гледа назад. Но съдбата ни бе вплетена в пламък, който не подлежи на поправка. Ние живяхме и изгоряхме така, както можехме.</w:t>
-      </w:r>
-    </w:p>
-    <w:p>
-      <w:pPr>
-        <w:pStyle w:val="NormalWeb"/>
+        <w:pStyle w:val="HTMLPreformatted"/>
+        <w:rPr>
+          <w:rFonts w:ascii="Cascadia Mono" w:hAnsi="Cascadia Mono" w:cs="Cascadia Mono"/>
+          <w:b/>
+          <w:bCs/>
+          <w:color w:val="000000" w:themeColor="text1"/>
+          <w:sz w:val="24"/>
+          <w:szCs w:val="24"/>
+        </w:rPr>
+      </w:pPr>
+      <w:r>
+        <w:rPr>
+          <w:rStyle w:val="Strong"/>
+        </w:rPr>
+        <w:t xml:space="preserve">2. </w:t>
+      </w:r>
+      <w:r>
+        <w:rPr>
+          <w:rFonts w:ascii="Cascadia Mono" w:hAnsi="Cascadia Mono" w:cs="Cascadia Mono"/>
+          <w:b/>
+          <w:bCs/>
+          <w:color w:val="000000" w:themeColor="text1"/>
+          <w:sz w:val="22"/>
+          <w:szCs w:val="22"/>
+        </w:rPr>
+        <w:t>Защо си сменихте жанра след</w:t>
+      </w:r>
+      <w:r>
+        <w:rPr>
+          <w:rFonts w:ascii="Cascadia Mono" w:hAnsi="Cascadia Mono" w:cs="Cascadia Mono"/>
+          <w:b/>
+          <w:bCs/>
+          <w:color w:val="000000" w:themeColor="text1"/>
+          <w:sz w:val="22"/>
+          <w:szCs w:val="22"/>
+        </w:rPr>
+        <w:t xml:space="preserve"> </w:t>
+      </w:r>
+      <w:r>
+        <w:rPr>
+          <w:rFonts w:ascii="Cascadia Mono" w:hAnsi="Cascadia Mono" w:cs="Cascadia Mono"/>
+          <w:b/>
+          <w:bCs/>
+          <w:color w:val="000000" w:themeColor="text1"/>
+          <w:sz w:val="22"/>
+          <w:szCs w:val="22"/>
+        </w:rPr>
+        <w:t>Илинденското възтания?</w:t>
+      </w:r>
+      <w:r>
+        <w:rPr>
+          <w:rFonts w:ascii="Cascadia Mono" w:hAnsi="Cascadia Mono" w:cs="Cascadia Mono"/>
+          <w:b/>
+          <w:bCs/>
+          <w:color w:val="000000" w:themeColor="text1"/>
+          <w:sz w:val="22"/>
+          <w:szCs w:val="22"/>
+          <w:lang w:val="en-US"/>
+        </w:rPr>
+        <w:t xml:space="preserve"> </w:t>
+      </w:r>
+      <w:r>
+        <w:rPr>
+          <w:rFonts w:ascii="Cascadia Mono" w:hAnsi="Cascadia Mono" w:cs="Cascadia Mono"/>
+          <w:b/>
+          <w:bCs/>
+          <w:color w:val="00B050"/>
+          <w:sz w:val="24"/>
+          <w:szCs w:val="24"/>
+          <w:highlight w:val="green"/>
+        </w:rPr>
+        <w:t>// направен</w:t>
+      </w:r>
+    </w:p>
+    <w:p>
+      <w:pPr>
+        <w:pStyle w:val="HTMLPreformatted"/>
+        <w:rPr>
+          <w:rFonts w:ascii="Cascadia Mono" w:hAnsi="Cascadia Mono" w:cs="Cascadia Mono"/>
+          <w:b/>
+          <w:bCs/>
+          <w:color w:val="000000" w:themeColor="text1"/>
+          <w:sz w:val="24"/>
+          <w:szCs w:val="24"/>
+        </w:rPr>
+      </w:pPr>
+    </w:p>
+    <w:p>
+      <w:pPr>
+        <w:pStyle w:val="HTMLPreformatted"/>
+        <w:rPr>
+          <w:rFonts w:ascii="Times New Roman" w:hAnsi="Times New Roman" w:cs="Times New Roman"/>
+          <w:color w:val="000000" w:themeColor="text1"/>
+          <w:sz w:val="24"/>
+          <w:szCs w:val="24"/>
+        </w:rPr>
+      </w:pPr>
+      <w:r>
+        <w:rPr>
+          <w:rFonts w:ascii="Times New Roman" w:hAnsi="Times New Roman" w:cs="Times New Roman"/>
+          <w:color w:val="000000" w:themeColor="text1"/>
+          <w:sz w:val="24"/>
+          <w:szCs w:val="24"/>
+        </w:rPr>
+        <w:t>След Илинден сърцето ми не можа вече да бъде само хроника видях човешката трагедия и тя поиска стих. Жанрът се смени, защото думите търсеха не факти,а сълзи и мълчание,които да превърнат болката в песен.Писах, за да изповядам съдбата на народа не като историк, а като човек, който носи раните им в гърдите си.</w:t>
+      </w:r>
+    </w:p>
+    <w:p>
+      <w:pPr>
+        <w:pStyle w:val="NormalWeb"/>
+        <w:rPr>
+          <w:rStyle w:val="Strong"/>
+          <w:color w:val="00B050"/>
+        </w:rPr>
       </w:pPr>
       <w:r>
         <w:rPr>
@@ -112,30 +192,40 @@
     </w:p>
     <w:p>
       <w:pPr>
-        <w:pStyle w:val="NormalWeb"/>
-      </w:pPr>
-      <w:r>
-        <w:t>Страданието е езикът, на който душата говори най-истински. Без него стихът остава празна черупка. Поетът плаща с болка за всяка своя дума.</w:t>
-      </w:r>
-    </w:p>
-    <w:p>
-      <w:pPr>
-        <w:pStyle w:val="NormalWeb"/>
-      </w:pPr>
-      <w:r>
-        <w:rPr>
-          <w:rFonts w:ascii="Segoe UI Emoji" w:hAnsi="Segoe UI Emoji" w:cs="Segoe UI Emoji"/>
-        </w:rPr>
-        <w:t>🔥</w:t>
-      </w:r>
-      <w:r>
-        <w:t xml:space="preserve"> </w:t>
-      </w:r>
-      <w:r>
-        <w:rPr>
-          <w:rStyle w:val="Strong"/>
-        </w:rPr>
-        <w:t>За революцията и Македония</w:t>
+        <w:pStyle w:val="HTMLPreformatted"/>
+        <w:rPr>
+          <w:rFonts w:ascii="Times New Roman" w:hAnsi="Times New Roman" w:cs="Times New Roman"/>
+          <w:color w:val="000000" w:themeColor="text1"/>
+          <w:sz w:val="24"/>
+          <w:szCs w:val="24"/>
+        </w:rPr>
+      </w:pPr>
+      <w:r>
+        <w:rPr>
+          <w:rFonts w:ascii="Times New Roman" w:hAnsi="Times New Roman" w:cs="Times New Roman"/>
+          <w:color w:val="000000" w:themeColor="text1"/>
+          <w:sz w:val="24"/>
+          <w:szCs w:val="24"/>
+        </w:rPr>
+        <w:t>Страданието е езикът, на който душата говори най-истински.</w:t>
+      </w:r>
+      <w:r>
+        <w:rPr>
+          <w:rFonts w:ascii="Times New Roman" w:hAnsi="Times New Roman" w:cs="Times New Roman"/>
+          <w:color w:val="000000" w:themeColor="text1"/>
+          <w:sz w:val="24"/>
+          <w:szCs w:val="24"/>
+        </w:rPr>
+        <w:t xml:space="preserve"> </w:t>
+      </w:r>
+      <w:r>
+        <w:rPr>
+          <w:rFonts w:ascii="Times New Roman" w:hAnsi="Times New Roman" w:cs="Times New Roman"/>
+          <w:color w:val="000000" w:themeColor="text1"/>
+          <w:sz w:val="24"/>
+          <w:szCs w:val="24"/>
+        </w:rPr>
+        <w:t>Без него стихът остава празна черупка. Поетът плаща с болка за всяка своя дума.</w:t>
       </w:r>
     </w:p>
     <w:p>
@@ -253,26 +343,6 @@
       </w:pPr>
       <w:r>
         <w:rPr>
-          <w:rFonts w:ascii="Segoe UI Emoji" w:hAnsi="Segoe UI Emoji" w:cs="Segoe UI Emoji"/>
-        </w:rPr>
-        <w:t>✒️</w:t>
-      </w:r>
-      <w:r>
-        <w:t xml:space="preserve"> </w:t>
-      </w:r>
-      <w:r>
-        <w:rPr>
-          <w:rStyle w:val="Strong"/>
-        </w:rPr>
-        <w:t>За поезията и творчеството</w:t>
-      </w:r>
-    </w:p>
-    <w:p>
-      <w:pPr>
-        <w:pStyle w:val="NormalWeb"/>
-      </w:pPr>
-      <w:r>
-        <w:rPr>
           <w:rStyle w:val="Strong"/>
         </w:rPr>
         <w:t xml:space="preserve">7. Какво чувство ви кара да пишете? </w:t>
@@ -357,28 +427,58 @@
         <w:pStyle w:val="NormalWeb"/>
       </w:pPr>
       <w:r>
-        <w:lastRenderedPageBreak/>
         <w:t>Поетът е сам по природа. Ако някой го разбере — това е дар. Но той пише не за разбиране, а защото не може иначе.</w:t>
       </w:r>
     </w:p>
     <w:p>
       <w:pPr>
-        <w:pStyle w:val="NormalWeb"/>
-      </w:pPr>
-      <w:r>
-        <w:rPr>
-          <w:rFonts w:ascii="Segoe UI Emoji" w:hAnsi="Segoe UI Emoji" w:cs="Segoe UI Emoji"/>
-        </w:rPr>
-        <w:t>🌫</w:t>
-      </w:r>
-      <w:r>
-        <w:t xml:space="preserve">️ </w:t>
-      </w:r>
-      <w:r>
-        <w:rPr>
-          <w:rStyle w:val="Strong"/>
-        </w:rPr>
-        <w:t>За трагедията и смисъла</w:t>
+        <w:pStyle w:val="HTMLPreformatted"/>
+        <w:rPr>
+          <w:rFonts w:ascii="Cascadia Mono" w:hAnsi="Cascadia Mono" w:cs="Cascadia Mono"/>
+          <w:color w:val="000000"/>
+          <w:sz w:val="18"/>
+          <w:szCs w:val="18"/>
+        </w:rPr>
+      </w:pPr>
+      <w:r>
+        <w:rPr>
+          <w:rStyle w:val="Strong"/>
+        </w:rPr>
+        <w:t xml:space="preserve">10. </w:t>
+      </w:r>
+      <w:r>
+        <w:rPr>
+          <w:rFonts w:ascii="Times New Roman" w:hAnsi="Times New Roman" w:cs="Times New Roman"/>
+          <w:b/>
+          <w:bCs/>
+          <w:color w:val="000000" w:themeColor="text1"/>
+          <w:sz w:val="24"/>
+          <w:szCs w:val="24"/>
+        </w:rPr>
+        <w:t>Кое вие е любимото ваше произведение?</w:t>
+      </w:r>
+      <w:r>
+        <w:rPr>
+          <w:rFonts w:ascii="Times New Roman" w:hAnsi="Times New Roman" w:cs="Times New Roman"/>
+          <w:b/>
+          <w:bCs/>
+          <w:color w:val="000000" w:themeColor="text1"/>
+          <w:sz w:val="24"/>
+          <w:szCs w:val="24"/>
+        </w:rPr>
+        <w:t xml:space="preserve"> </w:t>
+      </w:r>
+      <w:r>
+        <w:rPr>
+          <w:rFonts w:ascii="Times New Roman" w:hAnsi="Times New Roman" w:cs="Times New Roman"/>
+          <w:b/>
+          <w:bCs/>
+          <w:color w:val="00B050"/>
+          <w:sz w:val="24"/>
+          <w:szCs w:val="24"/>
+          <w:highlight w:val="green"/>
+        </w:rPr>
+        <w:t>// наппавено</w:t>
       </w:r>
     </w:p>
     <w:p>
@@ -388,19 +488,97 @@
           <w:lang w:val="en-US"/>
         </w:rPr>
       </w:pPr>
-      <w:r>
-        <w:rPr>
-          <w:rStyle w:val="Strong"/>
-        </w:rPr>
-        <w:t>10. Какво бихте казали на човек, който се бори със своите демони?</w:t>
-      </w:r>
-    </w:p>
-    <w:p>
-      <w:pPr>
-        <w:pStyle w:val="NormalWeb"/>
-      </w:pPr>
-      <w:r>
-        <w:t>Демоните не се побеждават, а се носат. Човек трябва да ги гледа в очите, за да не го погълнат. И да помни, че светлината често идва след най-дълбоката нощ.</w:t>
+    </w:p>
+    <w:p>
+      <w:pPr>
+        <w:pStyle w:val="HTMLPreformatted"/>
+        <w:rPr>
+          <w:rFonts w:ascii="Times New Roman" w:hAnsi="Times New Roman" w:cs="Times New Roman"/>
+          <w:color w:val="000000" w:themeColor="text1"/>
+          <w:sz w:val="24"/>
+          <w:szCs w:val="24"/>
+        </w:rPr>
+      </w:pPr>
+      <w:r>
+        <w:rPr>
+          <w:rFonts w:ascii="Times New Roman" w:hAnsi="Times New Roman" w:cs="Times New Roman"/>
+          <w:color w:val="000000" w:themeColor="text1"/>
+          <w:sz w:val="24"/>
+          <w:szCs w:val="24"/>
+        </w:rPr>
+        <w:t>Любимото ми произведение е „Арменци“.</w:t>
+      </w:r>
+      <w:r>
+        <w:rPr>
+          <w:rFonts w:ascii="Times New Roman" w:hAnsi="Times New Roman" w:cs="Times New Roman"/>
+          <w:color w:val="000000" w:themeColor="text1"/>
+          <w:sz w:val="24"/>
+          <w:szCs w:val="24"/>
+        </w:rPr>
+        <w:t xml:space="preserve"> </w:t>
+      </w:r>
+      <w:r>
+        <w:rPr>
+          <w:rFonts w:ascii="Times New Roman" w:hAnsi="Times New Roman" w:cs="Times New Roman"/>
+          <w:color w:val="000000" w:themeColor="text1"/>
+          <w:sz w:val="24"/>
+          <w:szCs w:val="24"/>
+        </w:rPr>
+        <w:t>В него аз търсих и намерих онова, което най-силно обичам</w:t>
+      </w:r>
+      <w:r>
+        <w:rPr>
+          <w:rFonts w:ascii="Times New Roman" w:hAnsi="Times New Roman" w:cs="Times New Roman"/>
+          <w:color w:val="000000" w:themeColor="text1"/>
+          <w:sz w:val="24"/>
+          <w:szCs w:val="24"/>
+        </w:rPr>
+        <w:t xml:space="preserve"> </w:t>
+      </w:r>
+      <w:r>
+        <w:rPr>
+          <w:rFonts w:ascii="Times New Roman" w:hAnsi="Times New Roman" w:cs="Times New Roman"/>
+          <w:color w:val="000000" w:themeColor="text1"/>
+          <w:sz w:val="24"/>
+          <w:szCs w:val="24"/>
+        </w:rPr>
+        <w:t>любовта, готова да се жертва и да умре.</w:t>
+      </w:r>
+      <w:r>
+        <w:rPr>
+          <w:rFonts w:ascii="Times New Roman" w:hAnsi="Times New Roman" w:cs="Times New Roman"/>
+          <w:color w:val="000000" w:themeColor="text1"/>
+          <w:sz w:val="24"/>
+          <w:szCs w:val="24"/>
+        </w:rPr>
+        <w:t xml:space="preserve"> </w:t>
+      </w:r>
+      <w:r>
+        <w:rPr>
+          <w:rFonts w:ascii="Times New Roman" w:hAnsi="Times New Roman" w:cs="Times New Roman"/>
+          <w:color w:val="000000" w:themeColor="text1"/>
+          <w:sz w:val="24"/>
+          <w:szCs w:val="24"/>
+        </w:rPr>
+        <w:t>То е родено от нощта на самотата и носи в себе си плача и надеждата на един разкъсан свят.</w:t>
+      </w:r>
+      <w:r>
+        <w:rPr>
+          <w:rFonts w:ascii="Times New Roman" w:hAnsi="Times New Roman" w:cs="Times New Roman"/>
+          <w:color w:val="000000" w:themeColor="text1"/>
+          <w:sz w:val="24"/>
+          <w:szCs w:val="24"/>
+        </w:rPr>
+        <w:t xml:space="preserve"> </w:t>
+      </w:r>
+      <w:r>
+        <w:rPr>
+          <w:rFonts w:ascii="Times New Roman" w:hAnsi="Times New Roman" w:cs="Times New Roman"/>
+          <w:color w:val="000000" w:themeColor="text1"/>
+          <w:sz w:val="24"/>
+          <w:szCs w:val="24"/>
+        </w:rPr>
+        <w:t>Това стихотворение ми говори като огън в мрака и ме прави по-малко сам.</w:t>
       </w:r>
     </w:p>
     <w:p>
@@ -471,41 +649,211 @@
     </w:p>
     <w:p>
       <w:pPr>
-        <w:pStyle w:val="NormalWeb"/>
-      </w:pPr>
-      <w:r>
-        <w:rPr>
-          <w:rFonts w:ascii="Segoe UI Emoji" w:hAnsi="Segoe UI Emoji" w:cs="Segoe UI Emoji"/>
-        </w:rPr>
-        <w:t>🌟</w:t>
-      </w:r>
-      <w:r>
-        <w:t xml:space="preserve"> </w:t>
-      </w:r>
-      <w:r>
-        <w:rPr>
-          <w:rStyle w:val="Strong"/>
-        </w:rPr>
-        <w:t>За самия него</w:t>
-      </w:r>
-    </w:p>
-    <w:p>
-      <w:pPr>
-        <w:pStyle w:val="NormalWeb"/>
-      </w:pPr>
-      <w:r>
-        <w:rPr>
-          <w:rStyle w:val="Strong"/>
-        </w:rPr>
-        <w:t>13. Кой е истинският Яворов?</w:t>
-      </w:r>
-    </w:p>
-    <w:p>
-      <w:pPr>
-        <w:pStyle w:val="NormalWeb"/>
-      </w:pPr>
-      <w:r>
-        <w:t>Аз съм човек, разкъсван между светлината и мрака. Поетът и революционерът са само лица на една и съща болка. Истинският Яворов е онзи, който търси смисъл в бездната.</w:t>
+        <w:pStyle w:val="HTMLPreformatted"/>
+        <w:rPr>
+          <w:rFonts w:ascii="Times New Roman" w:hAnsi="Times New Roman" w:cs="Times New Roman"/>
+          <w:b/>
+          <w:bCs/>
+          <w:color w:val="000000" w:themeColor="text1"/>
+          <w:sz w:val="24"/>
+          <w:szCs w:val="24"/>
+        </w:rPr>
+      </w:pPr>
+      <w:r>
+        <w:rPr>
+          <w:rStyle w:val="Strong"/>
+        </w:rPr>
+        <w:t xml:space="preserve">13. </w:t>
+      </w:r>
+      <w:r>
+        <w:rPr>
+          <w:rFonts w:ascii="Times New Roman" w:hAnsi="Times New Roman" w:cs="Times New Roman"/>
+          <w:b/>
+          <w:bCs/>
+          <w:color w:val="000000" w:themeColor="text1"/>
+          <w:sz w:val="24"/>
+          <w:szCs w:val="24"/>
+        </w:rPr>
+        <w:t>Ако можехте да промените нещо в живота си,</w:t>
+      </w:r>
+      <w:r>
+        <w:rPr>
+          <w:rFonts w:ascii="Times New Roman" w:hAnsi="Times New Roman" w:cs="Times New Roman"/>
+          <w:b/>
+          <w:bCs/>
+          <w:color w:val="000000" w:themeColor="text1"/>
+          <w:sz w:val="24"/>
+          <w:szCs w:val="24"/>
+        </w:rPr>
+        <w:t xml:space="preserve"> </w:t>
+      </w:r>
+      <w:r>
+        <w:rPr>
+          <w:rFonts w:ascii="Times New Roman" w:hAnsi="Times New Roman" w:cs="Times New Roman"/>
+          <w:b/>
+          <w:bCs/>
+          <w:color w:val="000000" w:themeColor="text1"/>
+          <w:sz w:val="24"/>
+          <w:szCs w:val="24"/>
+        </w:rPr>
+        <w:t>какво би било</w:t>
+      </w:r>
+      <w:r>
+        <w:rPr>
+          <w:rFonts w:ascii="Times New Roman" w:hAnsi="Times New Roman" w:cs="Times New Roman"/>
+          <w:b/>
+          <w:bCs/>
+          <w:color w:val="000000" w:themeColor="text1"/>
+          <w:sz w:val="24"/>
+          <w:szCs w:val="24"/>
+        </w:rPr>
+        <w:t>?</w:t>
+      </w:r>
+      <w:r>
+        <w:rPr>
+          <w:rFonts w:ascii="Times New Roman" w:hAnsi="Times New Roman" w:cs="Times New Roman"/>
+          <w:b/>
+          <w:bCs/>
+          <w:color w:val="000000" w:themeColor="text1"/>
+          <w:sz w:val="24"/>
+          <w:szCs w:val="24"/>
+        </w:rPr>
+        <w:t xml:space="preserve"> </w:t>
+      </w:r>
+      <w:r>
+        <w:rPr>
+          <w:rFonts w:ascii="Times New Roman" w:hAnsi="Times New Roman" w:cs="Times New Roman"/>
+          <w:b/>
+          <w:bCs/>
+          <w:color w:val="00B050"/>
+          <w:sz w:val="24"/>
+          <w:szCs w:val="24"/>
+          <w:highlight w:val="green"/>
+        </w:rPr>
+        <w:t>// направено</w:t>
+      </w:r>
+    </w:p>
+    <w:p>
+      <w:pPr>
+        <w:pStyle w:val="HTMLPreformatted"/>
+        <w:rPr>
+          <w:rFonts w:ascii="Times New Roman" w:hAnsi="Times New Roman" w:cs="Times New Roman"/>
+          <w:b/>
+          <w:bCs/>
+          <w:color w:val="000000" w:themeColor="text1"/>
+          <w:sz w:val="24"/>
+          <w:szCs w:val="24"/>
+        </w:rPr>
+      </w:pPr>
+    </w:p>
+    <w:p>
+      <w:pPr>
+        <w:pStyle w:val="HTMLPreformatted"/>
+        <w:rPr>
+          <w:rFonts w:ascii="Times New Roman" w:hAnsi="Times New Roman" w:cs="Times New Roman"/>
+          <w:color w:val="000000" w:themeColor="text1"/>
+          <w:sz w:val="24"/>
+          <w:szCs w:val="24"/>
+        </w:rPr>
+      </w:pPr>
+      <w:r>
+        <w:rPr>
+          <w:rFonts w:ascii="Times New Roman" w:hAnsi="Times New Roman" w:cs="Times New Roman"/>
+          <w:color w:val="000000" w:themeColor="text1"/>
+          <w:sz w:val="24"/>
+          <w:szCs w:val="24"/>
+        </w:rPr>
+        <w:t>Ако можех да променя нещо, щях да изтрия онзи миг,</w:t>
+      </w:r>
+      <w:r>
+        <w:rPr>
+          <w:rFonts w:ascii="Times New Roman" w:hAnsi="Times New Roman" w:cs="Times New Roman"/>
+          <w:color w:val="000000" w:themeColor="text1"/>
+          <w:sz w:val="24"/>
+          <w:szCs w:val="24"/>
+        </w:rPr>
+        <w:t xml:space="preserve"> </w:t>
+      </w:r>
+      <w:r>
+        <w:rPr>
+          <w:rFonts w:ascii="Times New Roman" w:hAnsi="Times New Roman" w:cs="Times New Roman"/>
+          <w:color w:val="000000" w:themeColor="text1"/>
+          <w:sz w:val="24"/>
+          <w:szCs w:val="24"/>
+        </w:rPr>
+        <w:t>в който не посмях да кажа всичко, което гореше в мен.</w:t>
+      </w:r>
+      <w:r>
+        <w:rPr>
+          <w:rFonts w:ascii="Times New Roman" w:hAnsi="Times New Roman" w:cs="Times New Roman"/>
+          <w:color w:val="000000" w:themeColor="text1"/>
+          <w:sz w:val="24"/>
+          <w:szCs w:val="24"/>
+        </w:rPr>
+        <w:t xml:space="preserve"> </w:t>
+      </w:r>
+      <w:r>
+        <w:rPr>
+          <w:rFonts w:ascii="Times New Roman" w:hAnsi="Times New Roman" w:cs="Times New Roman"/>
+          <w:color w:val="000000" w:themeColor="text1"/>
+          <w:sz w:val="24"/>
+          <w:szCs w:val="24"/>
+        </w:rPr>
+        <w:t>Щях да дам на любовта повече смелост и на тъгата</w:t>
+      </w:r>
+      <w:r>
+        <w:rPr>
+          <w:rFonts w:ascii="Times New Roman" w:hAnsi="Times New Roman" w:cs="Times New Roman"/>
+          <w:color w:val="000000" w:themeColor="text1"/>
+          <w:sz w:val="24"/>
+          <w:szCs w:val="24"/>
+        </w:rPr>
+        <w:t xml:space="preserve"> </w:t>
+      </w:r>
+      <w:r>
+        <w:rPr>
+          <w:rFonts w:ascii="Times New Roman" w:hAnsi="Times New Roman" w:cs="Times New Roman"/>
+          <w:color w:val="000000" w:themeColor="text1"/>
+          <w:sz w:val="24"/>
+          <w:szCs w:val="24"/>
+        </w:rPr>
+        <w:t>по-малко власт над дните ми.</w:t>
+      </w:r>
+      <w:r>
+        <w:rPr>
+          <w:rFonts w:ascii="Times New Roman" w:hAnsi="Times New Roman" w:cs="Times New Roman"/>
+          <w:color w:val="000000" w:themeColor="text1"/>
+          <w:sz w:val="24"/>
+          <w:szCs w:val="24"/>
+        </w:rPr>
+        <w:t xml:space="preserve"> </w:t>
+      </w:r>
+      <w:r>
+        <w:rPr>
+          <w:rFonts w:ascii="Times New Roman" w:hAnsi="Times New Roman" w:cs="Times New Roman"/>
+          <w:color w:val="000000" w:themeColor="text1"/>
+          <w:sz w:val="24"/>
+          <w:szCs w:val="24"/>
+        </w:rPr>
+        <w:t>Но може би всяка рана ме е ковала,</w:t>
+      </w:r>
+      <w:r>
+        <w:rPr>
+          <w:rFonts w:ascii="Times New Roman" w:hAnsi="Times New Roman" w:cs="Times New Roman"/>
+          <w:color w:val="000000" w:themeColor="text1"/>
+          <w:sz w:val="24"/>
+          <w:szCs w:val="24"/>
+        </w:rPr>
+        <w:t xml:space="preserve"> </w:t>
+      </w:r>
+      <w:r>
+        <w:rPr>
+          <w:rFonts w:ascii="Times New Roman" w:hAnsi="Times New Roman" w:cs="Times New Roman"/>
+          <w:color w:val="000000" w:themeColor="text1"/>
+          <w:sz w:val="24"/>
+          <w:szCs w:val="24"/>
+        </w:rPr>
+        <w:t>промяната би отнела и песента, и мълчанието ми.</w:t>
       </w:r>
     </w:p>
     <w:p>
@@ -558,8 +906,6 @@
         </w:rPr>
         <w:t xml:space="preserve"> </w:t>
       </w:r>
-      <w:bookmarkStart w:id="0" w:name="_GoBack"/>
-      <w:bookmarkEnd w:id="0"/>
       <w:r>
         <w:rPr>
           <w:rStyle w:val="Strong"/>
@@ -580,17 +926,188 @@
     </w:p>
     <w:p>
       <w:pPr>
-        <w:pStyle w:val="NormalWeb"/>
-      </w:pPr>
-      <w:r>
-        <w:t>Мирът — онзи тих, човешки мир, който никога не намерих. Липсваше ми и простата радост, която съдбата ми отказа. Но може би така е трябвало да бъде.</w:t>
-      </w:r>
-    </w:p>
-    <w:p>
-      <w:pPr>
-        <w:rPr>
-          <w:b/>
-          <w:bCs/>
+        <w:pStyle w:val="HTMLPreformatted"/>
+        <w:rPr>
+          <w:rFonts w:ascii="Times New Roman" w:hAnsi="Times New Roman" w:cs="Times New Roman"/>
+          <w:color w:val="000000" w:themeColor="text1"/>
+          <w:sz w:val="24"/>
+          <w:szCs w:val="24"/>
+        </w:rPr>
+      </w:pPr>
+      <w:r>
+        <w:rPr>
+          <w:rFonts w:ascii="Times New Roman" w:hAnsi="Times New Roman" w:cs="Times New Roman"/>
+          <w:color w:val="000000" w:themeColor="text1"/>
+          <w:sz w:val="24"/>
+          <w:szCs w:val="24"/>
+        </w:rPr>
+        <w:t>Липсва ми онова, което никога не можах да имам</w:t>
+      </w:r>
+      <w:r>
+        <w:rPr>
+          <w:rFonts w:ascii="Times New Roman" w:hAnsi="Times New Roman" w:cs="Times New Roman"/>
+          <w:color w:val="000000" w:themeColor="text1"/>
+          <w:sz w:val="24"/>
+          <w:szCs w:val="24"/>
+        </w:rPr>
+        <w:t xml:space="preserve"> </w:t>
+      </w:r>
+      <w:r>
+        <w:rPr>
+          <w:rFonts w:ascii="Times New Roman" w:hAnsi="Times New Roman" w:cs="Times New Roman"/>
+          <w:color w:val="000000" w:themeColor="text1"/>
+          <w:sz w:val="24"/>
+          <w:szCs w:val="24"/>
+        </w:rPr>
+        <w:t>истинската любов, която изгаря и спасява.</w:t>
+      </w:r>
+      <w:r>
+        <w:rPr>
+          <w:rFonts w:ascii="Times New Roman" w:hAnsi="Times New Roman" w:cs="Times New Roman"/>
+          <w:color w:val="000000" w:themeColor="text1"/>
+          <w:sz w:val="24"/>
+          <w:szCs w:val="24"/>
+        </w:rPr>
+        <w:t xml:space="preserve"> </w:t>
+      </w:r>
+      <w:r>
+        <w:rPr>
+          <w:rFonts w:ascii="Times New Roman" w:hAnsi="Times New Roman" w:cs="Times New Roman"/>
+          <w:color w:val="000000" w:themeColor="text1"/>
+          <w:sz w:val="24"/>
+          <w:szCs w:val="24"/>
+        </w:rPr>
+        <w:t>Липсва ми и свободата, която се изплъзна от ръцете ми.</w:t>
+      </w:r>
+      <w:r>
+        <w:rPr>
+          <w:rFonts w:ascii="Times New Roman" w:hAnsi="Times New Roman" w:cs="Times New Roman"/>
+          <w:color w:val="000000" w:themeColor="text1"/>
+          <w:sz w:val="24"/>
+          <w:szCs w:val="24"/>
+        </w:rPr>
+        <w:t xml:space="preserve"> </w:t>
+      </w:r>
+      <w:r>
+        <w:rPr>
+          <w:rFonts w:ascii="Times New Roman" w:hAnsi="Times New Roman" w:cs="Times New Roman"/>
+          <w:color w:val="000000" w:themeColor="text1"/>
+          <w:sz w:val="24"/>
+          <w:szCs w:val="24"/>
+        </w:rPr>
+        <w:t>Но най-много ми липсва мирът в душата, който никога не намерих.</w:t>
+      </w:r>
+    </w:p>
+    <w:p>
+      <w:pPr>
+        <w:pStyle w:val="HTMLPreformatted"/>
+        <w:rPr>
+          <w:rFonts w:ascii="Times New Roman" w:hAnsi="Times New Roman" w:cs="Times New Roman"/>
+          <w:color w:val="000000" w:themeColor="text1"/>
+          <w:sz w:val="24"/>
+          <w:szCs w:val="24"/>
+        </w:rPr>
+      </w:pPr>
+    </w:p>
+    <w:p>
+      <w:pPr>
+        <w:pStyle w:val="NormalWeb"/>
+      </w:pPr>
+      <w:r>
+        <w:rPr>
+          <w:color w:val="000000" w:themeColor="text1"/>
+        </w:rPr>
+        <w:t>16.</w:t>
+      </w:r>
+      <w:r>
+        <w:rPr>
+          <w:rFonts w:ascii="Cascadia Mono" w:hAnsi="Cascadia Mono" w:cs="Cascadia Mono"/>
+          <w:color w:val="A31515"/>
+          <w:sz w:val="18"/>
+          <w:szCs w:val="18"/>
+        </w:rPr>
+        <w:t xml:space="preserve"> </w:t>
+      </w:r>
+      <w:r>
+        <w:rPr>
+          <w:b/>
+          <w:bCs/>
+          <w:color w:val="000000" w:themeColor="text1"/>
+        </w:rPr>
+        <w:t>Благодаря ви за отделеното време\nгосподин Яворов беше ми приятно</w:t>
+      </w:r>
+      <w:r>
+        <w:rPr>
+          <w:b/>
+          <w:bCs/>
+          <w:color w:val="000000" w:themeColor="text1"/>
+        </w:rPr>
+        <w:t>.</w:t>
+      </w:r>
+      <w:r>
+        <w:rPr>
+          <w:b/>
+          <w:bCs/>
+          <w:color w:val="000000" w:themeColor="text1"/>
+          <w:lang w:val="en-US"/>
+        </w:rPr>
+        <w:t xml:space="preserve"> </w:t>
+      </w:r>
+      <w:r>
+        <w:rPr>
+          <w:rStyle w:val="Strong"/>
+          <w:color w:val="00B050"/>
+          <w:highlight w:val="green"/>
+          <w:lang w:val="en-US"/>
+        </w:rPr>
+        <w:t xml:space="preserve">// </w:t>
+      </w:r>
+      <w:r>
+        <w:rPr>
+          <w:rStyle w:val="Strong"/>
+          <w:color w:val="00B050"/>
+          <w:highlight w:val="green"/>
+        </w:rPr>
+        <w:t>направен</w:t>
+      </w:r>
+    </w:p>
+    <w:p>
+      <w:pPr>
+        <w:pStyle w:val="HTMLPreformatted"/>
+        <w:rPr>
+          <w:rFonts w:ascii="Times New Roman" w:hAnsi="Times New Roman" w:cs="Times New Roman"/>
+          <w:color w:val="000000" w:themeColor="text1"/>
+          <w:sz w:val="24"/>
+          <w:szCs w:val="24"/>
+        </w:rPr>
+      </w:pPr>
+      <w:r>
+        <w:rPr>
+          <w:rFonts w:ascii="Times New Roman" w:hAnsi="Times New Roman" w:cs="Times New Roman"/>
+          <w:color w:val="000000" w:themeColor="text1"/>
+          <w:sz w:val="24"/>
+          <w:szCs w:val="24"/>
+        </w:rPr>
+        <w:t>И аз благодаря, и на мен ми беше приятно</w:t>
+      </w:r>
+      <w:r>
+        <w:rPr>
+          <w:rFonts w:ascii="Times New Roman" w:hAnsi="Times New Roman" w:cs="Times New Roman"/>
+          <w:color w:val="000000" w:themeColor="text1"/>
+          <w:sz w:val="24"/>
+          <w:szCs w:val="24"/>
+        </w:rPr>
+        <w:t>.</w:t>
+      </w:r>
+    </w:p>
+    <w:p>
+      <w:pPr>
+        <w:pStyle w:val="HTMLPreformatted"/>
+        <w:rPr>
+          <w:rFonts w:ascii="Times New Roman" w:hAnsi="Times New Roman" w:cs="Times New Roman"/>
+          <w:color w:val="000000"/>
+          <w:sz w:val="24"/>
+          <w:szCs w:val="24"/>
         </w:rPr>
       </w:pPr>
     </w:p>
@@ -605,7 +1122,7 @@
 </file>
 
 <file path=word/styles.xml><?xml version="1.0" encoding="utf-8"?>
-<w:styles xmlns:mc="http://schemas.openxmlformats.org/markup-compatibility/2006" xmlns:r="http://schemas.openxmlformats.org/officeDocument/2006/relationships" xmlns:w="http://schemas.openxmlformats.org/wordprocessingml/2006/main" xmlns:w14="http://schemas.microsoft.com/office/word/2010/wordml" xmlns:w15="http://schemas.microsoft.com/office/word/2012/wordml" mc:Ignorable="w14 w15">
+<w:styles xmlns:mc="http://schemas.openxmlformats.org/markup-compatibility/2006" xmlns:r="http://schemas.openxmlformats.org/officeDocument/2006/relationships" xmlns:w="http://schemas.openxmlformats.org/wordprocessingml/2006/main" xmlns:w14="http://schemas.microsoft.com/office/word/2010/wordml" xmlns:w15="http://schemas.microsoft.com/office/word/2012/wordml" xmlns:w16cex="http://schemas.microsoft.com/office/word/2018/wordml/cex" xmlns:w16cid="http://schemas.microsoft.com/office/word/2016/wordml/cid" xmlns:w16="http://schemas.microsoft.com/office/word/2018/wordml" xmlns:w16sdtdh="http://schemas.microsoft.com/office/word/2020/wordml/sdtdatahash" xmlns:w16se="http://schemas.microsoft.com/office/word/2015/wordml/symex" mc:Ignorable="w14 w15 w16se w16cid w16 w16cex w16sdtdh">
   <w:docDefaults>
     <w:rPrDefault>
       <w:rPr>
@@ -621,7 +1138,7 @@
       </w:pPr>
     </w:pPrDefault>
   </w:docDefaults>
-  <w:latentStyles w:defLockedState="0" w:defUIPriority="99" w:defSemiHidden="0" w:defUnhideWhenUsed="0" w:defQFormat="0" w:count="371">
+  <w:latentStyles w:defLockedState="0" w:defUIPriority="99" w:defSemiHidden="0" w:defUnhideWhenUsed="0" w:defQFormat="0" w:count="376">
     <w:lsdException w:name="Normal" w:uiPriority="0" w:qFormat="1"/>
     <w:lsdException w:name="heading 1" w:uiPriority="9" w:qFormat="1"/>
     <w:lsdException w:name="heading 2" w:semiHidden="1" w:uiPriority="9" w:unhideWhenUsed="1" w:qFormat="1"/>
@@ -727,7 +1244,6 @@
     <w:lsdException w:name="HTML Sample" w:semiHidden="1" w:unhideWhenUsed="1"/>
     <w:lsdException w:name="HTML Typewriter" w:semiHidden="1" w:unhideWhenUsed="1"/>
     <w:lsdException w:name="HTML Variable" w:semiHidden="1" w:unhideWhenUsed="1"/>
-    <w:lsdException w:name="Normal Table" w:semiHidden="1" w:unhideWhenUsed="1"/>
     <w:lsdException w:name="annotation subject" w:semiHidden="1" w:unhideWhenUsed="1"/>
     <w:lsdException w:name="No List" w:semiHidden="1" w:unhideWhenUsed="1"/>
     <w:lsdException w:name="Outline List 1" w:semiHidden="1" w:unhideWhenUsed="1"/>
@@ -770,11 +1286,8 @@
     <w:lsdException w:name="Table Contemporary" w:semiHidden="1" w:unhideWhenUsed="1"/>
     <w:lsdException w:name="Table Elegant" w:semiHidden="1" w:unhideWhenUsed="1"/>
     <w:lsdException w:name="Table Professional" w:semiHidden="1" w:unhideWhenUsed="1"/>
-    <w:lsdException w:name="Table Subtle 1" w:semiHidden="1" w:unhideWhenUsed="1"/>
     <w:lsdException w:name="Table Subtle 2" w:semiHidden="1" w:unhideWhenUsed="1"/>
     <w:lsdException w:name="Table Web 1" w:semiHidden="1" w:unhideWhenUsed="1"/>
-    <w:lsdException w:name="Table Web 2" w:semiHidden="1" w:unhideWhenUsed="1"/>
-    <w:lsdException w:name="Table Web 3" w:semiHidden="1" w:unhideWhenUsed="1"/>
     <w:lsdException w:name="Balloon Text" w:semiHidden="1" w:unhideWhenUsed="1"/>
     <w:lsdException w:name="Table Grid" w:uiPriority="39"/>
     <w:lsdException w:name="Table Theme" w:semiHidden="1" w:unhideWhenUsed="1"/>
@@ -993,6 +1506,11 @@
     <w:lsdException w:name="List Table 5 Dark Accent 6" w:uiPriority="50"/>
     <w:lsdException w:name="List Table 6 Colorful Accent 6" w:uiPriority="51"/>
     <w:lsdException w:name="List Table 7 Colorful Accent 6" w:uiPriority="52"/>
+    <w:lsdException w:name="Mention" w:semiHidden="1" w:unhideWhenUsed="1"/>
+    <w:lsdException w:name="Smart Hyperlink" w:semiHidden="1" w:unhideWhenUsed="1"/>
+    <w:lsdException w:name="Hashtag" w:semiHidden="1" w:unhideWhenUsed="1"/>
+    <w:lsdException w:name="Unresolved Mention" w:semiHidden="1" w:unhideWhenUsed="1"/>
+    <w:lsdException w:name="Smart Link" w:semiHidden="1" w:unhideWhenUsed="1"/>
   </w:latentStyles>
   <w:style w:type="paragraph" w:default="1" w:styleId="Normal">
     <w:name w:val="Normal"/>
@@ -1029,7 +1547,6 @@
     <w:name w:val="Normal (Web)"/>
     <w:basedOn w:val="Normal"/>
     <w:uiPriority w:val="99"/>
-    <w:semiHidden/>
     <w:unhideWhenUsed/>
     <w:rsid w:val="00316D9B"/>
     <w:pPr>
@@ -1051,6 +1568,54 @@
     <w:rPr>
       <w:b/>
       <w:bCs/>
+    </w:rPr>
+  </w:style>
+  <w:style w:type="paragraph" w:styleId="HTMLPreformatted">
+    <w:name w:val="HTML Preformatted"/>
+    <w:basedOn w:val="Normal"/>
+    <w:link w:val="HTMLPreformattedChar"/>
+    <w:uiPriority w:val="99"/>
+    <w:unhideWhenUsed/>
+    <w:rsid w:val="00385F43"/>
+    <w:pPr>
+      <w:tabs>
+        <w:tab w:val="left" w:pos="916"/>
+        <w:tab w:val="left" w:pos="1832"/>
+        <w:tab w:val="left" w:pos="2748"/>
+        <w:tab w:val="left" w:pos="3664"/>
+        <w:tab w:val="left" w:pos="4580"/>
+        <w:tab w:val="left" w:pos="5496"/>
+        <w:tab w:val="left" w:pos="6412"/>
+        <w:tab w:val="left" w:pos="7328"/>
+        <w:tab w:val="left" w:pos="8244"/>
+        <w:tab w:val="left" w:pos="9160"/>
+        <w:tab w:val="left" w:pos="10076"/>
+        <w:tab w:val="left" w:pos="10992"/>
+        <w:tab w:val="left" w:pos="11908"/>
+        <w:tab w:val="left" w:pos="12824"/>
+        <w:tab w:val="left" w:pos="13740"/>
+        <w:tab w:val="left" w:pos="14656"/>
+      </w:tabs>
+      <w:spacing w:after="0" w:line="240" w:lineRule="auto"/>
+    </w:pPr>
+    <w:rPr>
+      <w:rFonts w:ascii="Courier New" w:eastAsia="Times New Roman" w:hAnsi="Courier New" w:cs="Courier New"/>
+      <w:sz w:val="20"/>
+      <w:szCs w:val="20"/>
+      <w:lang w:eastAsia="bg-BG"/>
+    </w:rPr>
+  </w:style>
+  <w:style w:type="character" w:customStyle="1" w:styleId="HTMLPreformattedChar">
+    <w:name w:val="HTML Preformatted Char"/>
+    <w:basedOn w:val="DefaultParagraphFont"/>
+    <w:link w:val="HTMLPreformatted"/>
+    <w:uiPriority w:val="99"/>
+    <w:rsid w:val="00385F43"/>
+    <w:rPr>
+      <w:rFonts w:ascii="Courier New" w:eastAsia="Times New Roman" w:hAnsi="Courier New" w:cs="Courier New"/>
+      <w:sz w:val="20"/>
+      <w:szCs w:val="20"/>
+      <w:lang w:eastAsia="bg-BG"/>
     </w:rPr>
   </w:style>
 </w:styles>

</xml_diff>